<commit_message>
Tuan 4 + 5
</commit_message>
<xml_diff>
--- a/Phiếu_BÁO CÁO HỌC TẬP CÁ NHÂN NHÓM 2.docx
+++ b/Phiếu_BÁO CÁO HỌC TẬP CÁ NHÂN NHÓM 2.docx
@@ -10,8 +10,6 @@
           <w:sz w:val="32"/>
         </w:rPr>
       </w:pPr>
-      <w:bookmarkStart w:id="0" w:name="_GoBack"/>
-      <w:bookmarkEnd w:id="0"/>
       <w:r>
         <w:rPr>
           <w:b/>
@@ -371,11 +369,13 @@
         <w:tc>
           <w:tcPr>
             <w:tcW w:w="3119" w:type="dxa"/>
-            <w:vMerge w:val="restart"/>
           </w:tcPr>
           <w:p>
             <w:r>
               <w:t>Hoàn thành</w:t>
+            </w:r>
+            <w:r>
+              <w:t xml:space="preserve"> 100%</w:t>
             </w:r>
           </w:p>
         </w:tc>
@@ -432,9 +432,12 @@
         <w:tc>
           <w:tcPr>
             <w:tcW w:w="3119" w:type="dxa"/>
-            <w:vMerge/>
-          </w:tcPr>
-          <w:p/>
+          </w:tcPr>
+          <w:p>
+            <w:r>
+              <w:t>Hoàn thành 100%</w:t>
+            </w:r>
+          </w:p>
         </w:tc>
         <w:tc>
           <w:tcPr>
@@ -482,9 +485,12 @@
         <w:tc>
           <w:tcPr>
             <w:tcW w:w="3119" w:type="dxa"/>
-            <w:vMerge/>
-          </w:tcPr>
-          <w:p/>
+          </w:tcPr>
+          <w:p>
+            <w:r>
+              <w:t>Hoàn thành 90%</w:t>
+            </w:r>
+          </w:p>
         </w:tc>
         <w:tc>
           <w:tcPr>
@@ -548,9 +554,12 @@
         <w:tc>
           <w:tcPr>
             <w:tcW w:w="3119" w:type="dxa"/>
-            <w:vMerge/>
-          </w:tcPr>
-          <w:p/>
+          </w:tcPr>
+          <w:p>
+            <w:r>
+              <w:t>Hoàn thành 100%</w:t>
+            </w:r>
+          </w:p>
         </w:tc>
         <w:tc>
           <w:tcPr>
@@ -595,19 +604,20 @@
             </w:r>
             <w:r>
               <w:lastRenderedPageBreak/>
-              <w:t>phần</w:t>
-            </w:r>
-            <w:r>
-              <w:t xml:space="preserve"> Lời nói đầu và 1.3. Nội dung nghiên cứu</w:t>
+              <w:t>phần Lời nói đầu và 1.3. Nội dung nghiên cứu</w:t>
             </w:r>
           </w:p>
         </w:tc>
         <w:tc>
           <w:tcPr>
             <w:tcW w:w="3119" w:type="dxa"/>
-            <w:vMerge/>
-          </w:tcPr>
-          <w:p/>
+          </w:tcPr>
+          <w:p>
+            <w:r>
+              <w:lastRenderedPageBreak/>
+              <w:t>Hoàn thành 100%</w:t>
+            </w:r>
+          </w:p>
         </w:tc>
         <w:tc>
           <w:tcPr>
@@ -664,7 +674,7 @@
           </w:tcPr>
           <w:p>
             <w:r>
-              <w:t>Hoàn thành</w:t>
+              <w:t>Hoàn thành 100%</w:t>
             </w:r>
           </w:p>
         </w:tc>
@@ -920,7 +930,7 @@
             <w:r>
               <w:t xml:space="preserve">Viết báo cáo phần </w:t>
             </w:r>
-            <w:bookmarkStart w:id="1" w:name="_Toc230774902"/>
+            <w:bookmarkStart w:id="0" w:name="_Toc230774902"/>
             <w:r>
               <w:rPr>
                 <w:bCs/>
@@ -928,7 +938,7 @@
               </w:rPr>
               <w:t>2.2. Nghiên cứu, tìm hiểu về Chữ ký số Elgamal</w:t>
             </w:r>
-            <w:bookmarkEnd w:id="1"/>
+            <w:bookmarkEnd w:id="0"/>
             <w:r>
               <w:rPr>
                 <w:bCs/>
@@ -943,7 +953,11 @@
             <w:tcW w:w="3119" w:type="dxa"/>
             <w:vMerge w:val="restart"/>
           </w:tcPr>
-          <w:p/>
+          <w:p>
+            <w:r>
+              <w:t>Hoàn thành 100%</w:t>
+            </w:r>
+          </w:p>
         </w:tc>
         <w:tc>
           <w:tcPr>
@@ -1188,7 +1202,22 @@
           </w:tcPr>
           <w:p>
             <w:r>
-              <w:t>Cài đặt chương trình: Mã hóa, giải mã, giao diện.(Java)</w:t>
+              <w:t>Cài đặt chương trình: Mã hóa, giải mã,</w:t>
+            </w:r>
+            <w:r>
+              <w:t xml:space="preserve"> xác minh,</w:t>
+            </w:r>
+            <w:r>
+              <w:t xml:space="preserve"> giao diệ</w:t>
+            </w:r>
+            <w:r>
+              <w:t>n</w:t>
+            </w:r>
+            <w:r>
+              <w:t>(Java)</w:t>
+            </w:r>
+            <w:r>
+              <w:t>.</w:t>
             </w:r>
           </w:p>
         </w:tc>
@@ -1197,7 +1226,11 @@
             <w:tcW w:w="3119" w:type="dxa"/>
             <w:vMerge w:val="restart"/>
           </w:tcPr>
-          <w:p/>
+          <w:p>
+            <w:r>
+              <w:t>Hoàn thành 100%</w:t>
+            </w:r>
+          </w:p>
         </w:tc>
         <w:tc>
           <w:tcPr>
@@ -1285,11 +1318,19 @@
         <w:tc>
           <w:tcPr>
             <w:tcW w:w="3827" w:type="dxa"/>
-            <w:vMerge w:val="restart"/>
-          </w:tcPr>
-          <w:p>
-            <w:r>
-              <w:t>Cài đặt chương trình: Mã hóa, giải mã, sinh khóa, giao diện(C#).</w:t>
+          </w:tcPr>
+          <w:p>
+            <w:r>
+              <w:t>Cài đặt thuật toán</w:t>
+            </w:r>
+            <w:r>
+              <w:t>:</w:t>
+            </w:r>
+            <w:r>
+              <w:t xml:space="preserve"> tạo khoá và chữ ký</w:t>
+            </w:r>
+            <w:r>
+              <w:t>(C#).</w:t>
             </w:r>
           </w:p>
         </w:tc>
@@ -1336,9 +1377,15 @@
         <w:tc>
           <w:tcPr>
             <w:tcW w:w="3827" w:type="dxa"/>
-            <w:vMerge/>
-          </w:tcPr>
-          <w:p/>
+          </w:tcPr>
+          <w:p>
+            <w:r>
+              <w:t>Cài đặt thuật toán</w:t>
+            </w:r>
+            <w:r>
+              <w:t>: xác minh(C#).</w:t>
+            </w:r>
+          </w:p>
         </w:tc>
         <w:tc>
           <w:tcPr>
@@ -1386,10 +1433,7 @@
           </w:tcPr>
           <w:p>
             <w:r>
-              <w:t>Kiểm thử</w:t>
-            </w:r>
-            <w:r>
-              <w:t xml:space="preserve"> 2 chương trình Java và C#</w:t>
+              <w:t>Giao diện(C#).</w:t>
             </w:r>
           </w:p>
         </w:tc>
@@ -1541,10 +1585,7 @@
           </w:tcPr>
           <w:p>
             <w:r>
-              <w:t>Viết báo cáo phần 3.1. Kiến thức kỹ năng đã học được trong quá trình thực hiện đề</w:t>
-            </w:r>
-            <w:r>
-              <w:t xml:space="preserve"> tài và phần 3.3. </w:t>
+              <w:t xml:space="preserve">Viết báo cáo phần 3.1. Kiến thức kỹ năng đã học được trong quá trình thực hiện đề tài và phần 3.3. </w:t>
             </w:r>
             <w:r>
               <w:t xml:space="preserve">Đề xuất về tính khả thi của chủ đề </w:t>
@@ -1669,7 +1710,7 @@
       </w:tr>
       <w:tr>
         <w:trPr>
-          <w:trHeight w:val="231"/>
+          <w:trHeight w:val="484"/>
         </w:trPr>
         <w:tc>
           <w:tcPr>
@@ -1685,6 +1726,7 @@
         <w:tc>
           <w:tcPr>
             <w:tcW w:w="2268" w:type="dxa"/>
+            <w:vMerge w:val="restart"/>
           </w:tcPr>
           <w:p>
             <w:r>
@@ -1701,6 +1743,48 @@
               <w:t>Viết báo cáo phần 3.2. Bài học kinh nghiệm.</w:t>
             </w:r>
           </w:p>
+        </w:tc>
+        <w:tc>
+          <w:tcPr>
+            <w:tcW w:w="3119" w:type="dxa"/>
+            <w:vMerge/>
+          </w:tcPr>
+          <w:p/>
+        </w:tc>
+        <w:tc>
+          <w:tcPr>
+            <w:tcW w:w="3118" w:type="dxa"/>
+            <w:vMerge/>
+          </w:tcPr>
+          <w:p/>
+        </w:tc>
+      </w:tr>
+      <w:tr>
+        <w:trPr>
+          <w:trHeight w:val="483"/>
+        </w:trPr>
+        <w:tc>
+          <w:tcPr>
+            <w:tcW w:w="846" w:type="dxa"/>
+            <w:vMerge/>
+          </w:tcPr>
+          <w:p>
+            <w:pPr>
+              <w:jc w:val="center"/>
+            </w:pPr>
+          </w:p>
+        </w:tc>
+        <w:tc>
+          <w:tcPr>
+            <w:tcW w:w="2268" w:type="dxa"/>
+            <w:vMerge/>
+          </w:tcPr>
+          <w:p/>
+        </w:tc>
+        <w:tc>
+          <w:tcPr>
+            <w:tcW w:w="3827" w:type="dxa"/>
+          </w:tcPr>
           <w:p>
             <w:r>
               <w:t>Tổng hợp, chỉnh sửa báo cáo.</w:t>
@@ -1952,11 +2036,20 @@
         </w:numPr>
       </w:pPr>
       <w:r>
-        <w:t>Tên lớp: …</w:t>
-      </w:r>
-      <w:r>
-        <w:tab/>
-        <w:t>Khóa: ….</w:t>
+        <w:t>Tên lớp:</w:t>
+      </w:r>
+      <w:r>
+        <w:t xml:space="preserve"> </w:t>
+      </w:r>
+      <w:r>
+        <w:t>20252IT6070002</w:t>
+      </w:r>
+      <w:r>
+        <w:tab/>
+        <w:t xml:space="preserve">Khóa: </w:t>
+      </w:r>
+      <w:r>
+        <w:t>18</w:t>
       </w:r>
     </w:p>
     <w:p>
@@ -1968,16 +2061,169 @@
         </w:numPr>
       </w:pPr>
       <w:r>
-        <w:t xml:space="preserve">Họ và tên sinh viên (nếu giao phiếu học tập cá </w:t>
-      </w:r>
-      <w:proofErr w:type="gramStart"/>
-      <w:r>
-        <w:t>nhân)…</w:t>
-      </w:r>
-      <w:proofErr w:type="gramEnd"/>
-      <w:r>
-        <w:t>….</w:t>
-      </w:r>
+        <w:t>Họ và tên sinh viên</w:t>
+      </w:r>
+      <w:r>
+        <w:t xml:space="preserve"> </w:t>
+      </w:r>
+    </w:p>
+    <w:tbl>
+      <w:tblPr>
+        <w:tblStyle w:val="TableGrid"/>
+        <w:tblpPr w:leftFromText="180" w:rightFromText="180" w:vertAnchor="text" w:horzAnchor="margin" w:tblpXSpec="center" w:tblpY="-41"/>
+        <w:tblW w:w="0" w:type="auto"/>
+        <w:tblBorders>
+          <w:top w:val="none" w:sz="0" w:space="0" w:color="auto"/>
+          <w:left w:val="none" w:sz="0" w:space="0" w:color="auto"/>
+          <w:bottom w:val="none" w:sz="0" w:space="0" w:color="auto"/>
+          <w:right w:val="none" w:sz="0" w:space="0" w:color="auto"/>
+          <w:insideH w:val="none" w:sz="0" w:space="0" w:color="auto"/>
+          <w:insideV w:val="none" w:sz="0" w:space="0" w:color="auto"/>
+        </w:tblBorders>
+        <w:tblLook w:val="04A0" w:firstRow="1" w:lastRow="0" w:firstColumn="1" w:lastColumn="0" w:noHBand="0" w:noVBand="1"/>
+      </w:tblPr>
+      <w:tblGrid>
+        <w:gridCol w:w="4234"/>
+        <w:gridCol w:w="2003"/>
+      </w:tblGrid>
+      <w:tr>
+        <w:tc>
+          <w:tcPr>
+            <w:tcW w:w="4234" w:type="dxa"/>
+          </w:tcPr>
+          <w:p>
+            <w:r>
+              <w:t>Nguyễn Ánh Vân(Nhóm trưởng)</w:t>
+            </w:r>
+          </w:p>
+        </w:tc>
+        <w:tc>
+          <w:tcPr>
+            <w:tcW w:w="2003" w:type="dxa"/>
+          </w:tcPr>
+          <w:p>
+            <w:r>
+              <w:t>2023606604</w:t>
+            </w:r>
+          </w:p>
+        </w:tc>
+      </w:tr>
+      <w:tr>
+        <w:tc>
+          <w:tcPr>
+            <w:tcW w:w="4234" w:type="dxa"/>
+          </w:tcPr>
+          <w:p>
+            <w:r>
+              <w:t>Đào Văn Công</w:t>
+            </w:r>
+          </w:p>
+        </w:tc>
+        <w:tc>
+          <w:tcPr>
+            <w:tcW w:w="2003" w:type="dxa"/>
+          </w:tcPr>
+          <w:p>
+            <w:r>
+              <w:t>2023601884</w:t>
+            </w:r>
+          </w:p>
+        </w:tc>
+      </w:tr>
+      <w:tr>
+        <w:tc>
+          <w:tcPr>
+            <w:tcW w:w="4234" w:type="dxa"/>
+          </w:tcPr>
+          <w:p>
+            <w:r>
+              <w:t>Nguyễn Huy Hiệu</w:t>
+            </w:r>
+          </w:p>
+        </w:tc>
+        <w:tc>
+          <w:tcPr>
+            <w:tcW w:w="2003" w:type="dxa"/>
+          </w:tcPr>
+          <w:p>
+            <w:r>
+              <w:t>2023602822</w:t>
+            </w:r>
+          </w:p>
+        </w:tc>
+      </w:tr>
+      <w:tr>
+        <w:tc>
+          <w:tcPr>
+            <w:tcW w:w="4234" w:type="dxa"/>
+          </w:tcPr>
+          <w:p>
+            <w:r>
+              <w:t>Nguyễn Đức Trung</w:t>
+            </w:r>
+          </w:p>
+        </w:tc>
+        <w:tc>
+          <w:tcPr>
+            <w:tcW w:w="2003" w:type="dxa"/>
+          </w:tcPr>
+          <w:p>
+            <w:r>
+              <w:t>2023600531</w:t>
+            </w:r>
+          </w:p>
+        </w:tc>
+      </w:tr>
+      <w:tr>
+        <w:tc>
+          <w:tcPr>
+            <w:tcW w:w="4234" w:type="dxa"/>
+          </w:tcPr>
+          <w:p>
+            <w:r>
+              <w:t>Lê Thanh Tuân</w:t>
+            </w:r>
+          </w:p>
+        </w:tc>
+        <w:tc>
+          <w:tcPr>
+            <w:tcW w:w="2003" w:type="dxa"/>
+          </w:tcPr>
+          <w:p>
+            <w:r>
+              <w:t>2023601512</w:t>
+            </w:r>
+          </w:p>
+        </w:tc>
+      </w:tr>
+    </w:tbl>
+    <w:p>
+      <w:pPr>
+        <w:pStyle w:val="ListParagraph"/>
+      </w:pPr>
+      <w:r>
+        <w:t xml:space="preserve"> </w:t>
+      </w:r>
+    </w:p>
+    <w:p>
+      <w:pPr>
+        <w:pStyle w:val="ListParagraph"/>
+      </w:pPr>
+    </w:p>
+    <w:p>
+      <w:pPr>
+        <w:pStyle w:val="ListParagraph"/>
+      </w:pPr>
+    </w:p>
+    <w:p>
+      <w:pPr>
+        <w:pStyle w:val="ListParagraph"/>
+      </w:pPr>
+    </w:p>
+    <w:p>
+      <w:pPr>
+        <w:pStyle w:val="ListParagraph"/>
+      </w:pPr>
     </w:p>
     <w:p>
       <w:pPr>
@@ -1988,15 +2234,16 @@
         </w:numPr>
       </w:pPr>
       <w:r>
-        <w:t xml:space="preserve">Tên nhóm (nếu giao phiếu học tập </w:t>
-      </w:r>
-      <w:proofErr w:type="gramStart"/>
-      <w:r>
-        <w:t>nhóm)…</w:t>
-      </w:r>
-      <w:proofErr w:type="gramEnd"/>
-      <w:r>
-        <w:t>…. Họ và tên thành viên trong nhóm ……….</w:t>
+        <w:t>Tên nhóm</w:t>
+      </w:r>
+      <w:r>
+        <w:t>:</w:t>
+      </w:r>
+      <w:r>
+        <w:t xml:space="preserve"> </w:t>
+      </w:r>
+      <w:r>
+        <w:t>2</w:t>
       </w:r>
     </w:p>
     <w:p>
@@ -2052,28 +2299,7 @@
         <w:jc w:val="both"/>
       </w:pPr>
       <w:r>
-        <w:t xml:space="preserve">Hoạt động/ Nội dung 1: </w:t>
-      </w:r>
-      <w:r>
-        <w:rPr>
-          <w:rFonts w:eastAsia="Times New Roman"/>
-          <w:szCs w:val="26"/>
-        </w:rPr>
-        <w:t xml:space="preserve">Tìm tài liệu, nghiên cứu lý thuyết về an </w:t>
-      </w:r>
-      <w:r>
-        <w:rPr>
-          <w:rFonts w:eastAsia="Times New Roman"/>
-          <w:szCs w:val="26"/>
-        </w:rPr>
-        <w:t>ninh mạng</w:t>
-      </w:r>
-      <w:r>
-        <w:rPr>
-          <w:rFonts w:eastAsia="Times New Roman"/>
-          <w:szCs w:val="26"/>
-        </w:rPr>
-        <w:t xml:space="preserve"> …</w:t>
+        <w:t>Hoạt động 1: Tìm kiếm tài liệu và nghiên cứu lý thuyết nền tảng về an ninh mạng</w:t>
       </w:r>
     </w:p>
     <w:p>
@@ -2086,35 +2312,10 @@
         <w:jc w:val="both"/>
       </w:pPr>
       <w:r>
-        <w:t xml:space="preserve">Hoạt động/ Nội dung 2: </w:t>
-      </w:r>
-      <w:r>
-        <w:rPr>
-          <w:rFonts w:eastAsia="Times New Roman"/>
-          <w:szCs w:val="26"/>
-        </w:rPr>
-        <w:t xml:space="preserve">Cài đặt thuật toán, xây dựng </w:t>
-      </w:r>
-      <w:r>
-        <w:rPr>
-          <w:rFonts w:eastAsia="Times New Roman"/>
-          <w:szCs w:val="26"/>
-        </w:rPr>
-        <w:t>chương trình</w:t>
-      </w:r>
-      <w:r>
-        <w:rPr>
-          <w:rFonts w:eastAsia="Times New Roman"/>
-          <w:szCs w:val="26"/>
-        </w:rPr>
-        <w:t xml:space="preserve"> mô phỏng hoạt động của </w:t>
-      </w:r>
-      <w:r>
-        <w:rPr>
-          <w:rFonts w:eastAsia="Times New Roman"/>
-          <w:szCs w:val="26"/>
-        </w:rPr>
-        <w:t>…</w:t>
+        <w:t>Hoạt động 2: Cài đặt thuật toán và xây dựng hệ thống phần mềm mô phỏng ứng dụng</w:t>
+      </w:r>
+      <w:r>
+        <w:t>.</w:t>
       </w:r>
     </w:p>
     <w:p>
@@ -2127,14 +2328,10 @@
         <w:jc w:val="both"/>
       </w:pPr>
       <w:r>
-        <w:t xml:space="preserve">Hoạt động/ Nội dung 3: </w:t>
-      </w:r>
-      <w:r>
-        <w:rPr>
-          <w:rFonts w:eastAsia="Times New Roman"/>
-          <w:szCs w:val="26"/>
-        </w:rPr>
-        <w:t>Viết báo cáo tổng kết …</w:t>
+        <w:t>Hoạt động 3: Phân tích kết quả thực nghiệm và viết báo cáo tổng kết đề tài</w:t>
+      </w:r>
+      <w:r>
+        <w:t>.</w:t>
       </w:r>
     </w:p>
     <w:p>
@@ -2147,7 +2344,10 @@
         <w:jc w:val="both"/>
       </w:pPr>
       <w:r>
-        <w:t>Sản phẩm nghiên cứu (Bản thuyết minh, bài thu hoạch, mô hình, sơ đồ, bản vẽ, trang website, bài báo khoa học …)</w:t>
+        <w:t>Sản phẩm nghiên cứ</w:t>
+      </w:r>
+      <w:r>
+        <w:t>u:</w:t>
       </w:r>
     </w:p>
     <w:p>
@@ -2318,61 +2518,156 @@
     </w:p>
     <w:p>
       <w:pPr>
-        <w:pStyle w:val="ListParagraph"/>
+        <w:pStyle w:val="NormalWeb"/>
+        <w:spacing w:before="0" w:beforeAutospacing="0" w:after="0" w:afterAutospacing="0" w:line="312" w:lineRule="auto"/>
+        <w:ind w:left="720"/>
         <w:jc w:val="both"/>
+      </w:pPr>
+      <w:r>
         <w:rPr>
-          <w:szCs w:val="28"/>
+          <w:color w:val="000000"/>
+          <w:sz w:val="26"/>
+          <w:szCs w:val="26"/>
         </w:rPr>
-      </w:pPr>
-      <w:r>
-        <w:rPr>
-          <w:szCs w:val="28"/>
-        </w:rPr>
-        <w:t xml:space="preserve">[1]. Bùi Doãn Khanh, Nguyễn Đình Thúc, </w:t>
+        <w:t xml:space="preserve">[1]. Nguyễn Văn Tảo, Trần Thị Lượng, </w:t>
       </w:r>
       <w:r>
         <w:rPr>
           <w:i/>
-          <w:szCs w:val="28"/>
+          <w:iCs/>
+          <w:color w:val="000000"/>
+          <w:sz w:val="26"/>
+          <w:szCs w:val="26"/>
         </w:rPr>
-        <w:t>Mã hóa thông tin – Lý thuyết và ứng dụng</w:t>
-      </w:r>
+        <w:t xml:space="preserve">An toàn bảo mật dữ </w:t>
+      </w:r>
+      <w:proofErr w:type="gramStart"/>
       <w:r>
         <w:rPr>
-          <w:szCs w:val="28"/>
+          <w:i/>
+          <w:iCs/>
+          <w:color w:val="000000"/>
+          <w:sz w:val="26"/>
+          <w:szCs w:val="26"/>
         </w:rPr>
-        <w:t>, NXB Lao động xã hội, 2011.</w:t>
+        <w:t>liệu</w:t>
+      </w:r>
+      <w:r>
+        <w:rPr>
+          <w:color w:val="000000"/>
+          <w:sz w:val="26"/>
+          <w:szCs w:val="26"/>
+        </w:rPr>
+        <w:t>,NXB</w:t>
+      </w:r>
+      <w:proofErr w:type="gramEnd"/>
+      <w:r>
+        <w:rPr>
+          <w:color w:val="000000"/>
+          <w:sz w:val="26"/>
+          <w:szCs w:val="26"/>
+        </w:rPr>
+        <w:t xml:space="preserve"> Đại học Thái Nguyên, 2015</w:t>
       </w:r>
     </w:p>
     <w:p>
       <w:pPr>
-        <w:pStyle w:val="ListParagraph"/>
+        <w:pStyle w:val="NormalWeb"/>
+        <w:spacing w:before="0" w:beforeAutospacing="0" w:after="0" w:afterAutospacing="0" w:line="312" w:lineRule="auto"/>
+        <w:ind w:left="720"/>
         <w:jc w:val="both"/>
+      </w:pPr>
+      <w:r>
         <w:rPr>
-          <w:lang w:val="vi-VN"/>
+          <w:color w:val="000000"/>
+          <w:sz w:val="26"/>
+          <w:szCs w:val="26"/>
         </w:rPr>
-      </w:pPr>
+        <w:t>[2]</w:t>
+      </w:r>
+      <w:hyperlink r:id="rId5" w:history="1">
+        <w:r>
+          <w:rPr>
+            <w:rStyle w:val="Hyperlink"/>
+            <w:rFonts w:eastAsiaTheme="majorEastAsia"/>
+            <w:color w:val="000000"/>
+            <w:szCs w:val="26"/>
+          </w:rPr>
+          <w:t xml:space="preserve"> https://vi.wikipedia.org/wiki/An_ninh_m%E1%BA%A1ng</w:t>
+        </w:r>
+      </w:hyperlink>
+      <w:r>
+        <w:t xml:space="preserve"> </w:t>
+      </w:r>
       <w:r>
         <w:rPr>
-          <w:lang w:val="vi-VN"/>
+          <w:color w:val="000000"/>
+          <w:sz w:val="26"/>
+          <w:szCs w:val="26"/>
         </w:rPr>
-        <w:t xml:space="preserve">[2] … </w:t>
+        <w:t>(thời gian truy cập: 20h05, ngày 14/5/2026)</w:t>
       </w:r>
     </w:p>
     <w:p>
       <w:pPr>
         <w:pStyle w:val="ListParagraph"/>
+        <w:spacing w:after="0" w:line="312" w:lineRule="auto"/>
         <w:jc w:val="both"/>
       </w:pPr>
       <w:r>
+        <w:t xml:space="preserve">[3] Nguyễn Nam Hải, </w:t>
+      </w:r>
+      <w:r>
         <w:rPr>
-          <w:lang w:val="vi-VN"/>
+          <w:i/>
+          <w:iCs/>
         </w:rPr>
-        <w:t>[3]</w:t>
-      </w:r>
-      <w:r>
-        <w:t xml:space="preserve"> …</w:t>
-      </w:r>
+        <w:t xml:space="preserve">Giáo trình </w:t>
+      </w:r>
+      <w:proofErr w:type="gramStart"/>
+      <w:r>
+        <w:rPr>
+          <w:i/>
+          <w:iCs/>
+        </w:rPr>
+        <w:t>An</w:t>
+      </w:r>
+      <w:proofErr w:type="gramEnd"/>
+      <w:r>
+        <w:rPr>
+          <w:i/>
+          <w:iCs/>
+        </w:rPr>
+        <w:t xml:space="preserve"> toàn và Bảo mật thông tin</w:t>
+      </w:r>
+      <w:r>
+        <w:t>, Nhà xuất bản Thông tin và Truyền thông, 2021.</w:t>
+      </w:r>
+    </w:p>
+    <w:p>
+      <w:pPr>
+        <w:pStyle w:val="ListParagraph"/>
+        <w:spacing w:after="0" w:line="312" w:lineRule="auto"/>
+        <w:jc w:val="both"/>
+      </w:pPr>
+      <w:r>
+        <w:t xml:space="preserve">[4] Bruce Schneier, </w:t>
+      </w:r>
+      <w:r>
+        <w:rPr>
+          <w:i/>
+          <w:iCs/>
+        </w:rPr>
+        <w:t>Applied Cryptography: Protocols, Algorithms, and Source Code in C</w:t>
+      </w:r>
+      <w:r>
+        <w:t>, 20th Anniversary Edition, John Wiley &amp; Sons, 2015.</w:t>
+      </w:r>
+    </w:p>
+    <w:p>
+      <w:pPr>
+        <w:pStyle w:val="ListParagraph"/>
+      </w:pPr>
     </w:p>
     <w:p>
       <w:pPr>
@@ -2382,24 +2677,6 @@
           <w:numId w:val="6"/>
         </w:numPr>
         <w:jc w:val="both"/>
-        <w:rPr>
-          <w:lang w:val="vi-VN"/>
-        </w:rPr>
-      </w:pPr>
-      <w:r>
-        <w:rPr>
-          <w:lang w:val="vi-VN"/>
-        </w:rPr>
-        <w:t>Phương tiện, nguyên liệu thực hiện Bài tập lớn (nếu có):….</w:t>
-      </w:r>
-    </w:p>
-    <w:p>
-      <w:pPr>
-        <w:pStyle w:val="ListParagraph"/>
-        <w:numPr>
-          <w:ilvl w:val="0"/>
-          <w:numId w:val="4"/>
-        </w:numPr>
         <w:sectPr>
           <w:pgSz w:w="12240" w:h="15840"/>
           <w:pgMar w:top="851" w:right="1134" w:bottom="1134" w:left="1418" w:header="720" w:footer="720" w:gutter="0"/>
@@ -2408,7 +2685,16 @@
         </w:sectPr>
       </w:pPr>
       <w:r>
-        <w:t>Máy tính, …</w:t>
+        <w:rPr>
+          <w:lang w:val="vi-VN"/>
+        </w:rPr>
+        <w:t>Phương tiện, nguyên liệu thực hiện Bài tập lớn</w:t>
+      </w:r>
+      <w:r>
+        <w:t>: Máy tính</w:t>
+      </w:r>
+      <w:r>
+        <w:t xml:space="preserve"> </w:t>
       </w:r>
     </w:p>
     <w:p>
@@ -2454,16 +2740,26 @@
       </w:pPr>
     </w:p>
     <w:p>
-      <w:pPr>
+      <w:r>
         <w:rPr>
           <w:lang w:val="vi-VN"/>
         </w:rPr>
-      </w:pPr>
+        <w:t xml:space="preserve">Tên lớp: </w:t>
+      </w:r>
+      <w:r>
+        <w:t>20252IT6070002</w:t>
+      </w:r>
+      <w:r>
+        <w:t xml:space="preserve"> </w:t>
+      </w:r>
       <w:r>
         <w:rPr>
           <w:lang w:val="vi-VN"/>
         </w:rPr>
-        <w:t>Tên lớp: ….. Khóa: …</w:t>
+        <w:t>Khóa</w:t>
+      </w:r>
+      <w:r>
+        <w:t>: 18</w:t>
       </w:r>
     </w:p>
     <w:p>
@@ -2476,21 +2772,154 @@
         <w:rPr>
           <w:lang w:val="vi-VN"/>
         </w:rPr>
-        <w:t>Họ và tên sinh viên (nếu cá nhân thực hiện): …</w:t>
-      </w:r>
-    </w:p>
-    <w:p>
-      <w:pPr>
+        <w:t>Họ</w:t>
+      </w:r>
+      <w:r>
         <w:rPr>
           <w:lang w:val="vi-VN"/>
         </w:rPr>
-      </w:pPr>
-      <w:r>
+        <w:t xml:space="preserve"> và tên sinh viên</w:t>
+      </w:r>
+      <w:r>
+        <w:t xml:space="preserve">: </w:t>
+      </w:r>
+    </w:p>
+    <w:tbl>
+      <w:tblPr>
+        <w:tblStyle w:val="TableGrid"/>
+        <w:tblpPr w:leftFromText="180" w:rightFromText="180" w:vertAnchor="text" w:horzAnchor="page" w:tblpX="3204" w:tblpY="-7"/>
+        <w:tblW w:w="0" w:type="auto"/>
+        <w:tblBorders>
+          <w:top w:val="none" w:sz="0" w:space="0" w:color="auto"/>
+          <w:left w:val="none" w:sz="0" w:space="0" w:color="auto"/>
+          <w:bottom w:val="none" w:sz="0" w:space="0" w:color="auto"/>
+          <w:right w:val="none" w:sz="0" w:space="0" w:color="auto"/>
+          <w:insideH w:val="none" w:sz="0" w:space="0" w:color="auto"/>
+          <w:insideV w:val="none" w:sz="0" w:space="0" w:color="auto"/>
+        </w:tblBorders>
+        <w:tblLook w:val="04A0" w:firstRow="1" w:lastRow="0" w:firstColumn="1" w:lastColumn="0" w:noHBand="0" w:noVBand="1"/>
+      </w:tblPr>
+      <w:tblGrid>
+        <w:gridCol w:w="4234"/>
+        <w:gridCol w:w="2003"/>
+      </w:tblGrid>
+      <w:tr>
+        <w:tc>
+          <w:tcPr>
+            <w:tcW w:w="4234" w:type="dxa"/>
+          </w:tcPr>
+          <w:p>
+            <w:r>
+              <w:t>Nguyễn Ánh Vân(Nhóm trưởng)</w:t>
+            </w:r>
+          </w:p>
+        </w:tc>
+        <w:tc>
+          <w:tcPr>
+            <w:tcW w:w="2003" w:type="dxa"/>
+          </w:tcPr>
+          <w:p>
+            <w:r>
+              <w:t>2023606604</w:t>
+            </w:r>
+          </w:p>
+        </w:tc>
+      </w:tr>
+      <w:tr>
+        <w:tc>
+          <w:tcPr>
+            <w:tcW w:w="4234" w:type="dxa"/>
+          </w:tcPr>
+          <w:p>
+            <w:r>
+              <w:t>Đào Văn Công</w:t>
+            </w:r>
+          </w:p>
+        </w:tc>
+        <w:tc>
+          <w:tcPr>
+            <w:tcW w:w="2003" w:type="dxa"/>
+          </w:tcPr>
+          <w:p>
+            <w:r>
+              <w:t>2023601884</w:t>
+            </w:r>
+          </w:p>
+        </w:tc>
+      </w:tr>
+      <w:tr>
+        <w:tc>
+          <w:tcPr>
+            <w:tcW w:w="4234" w:type="dxa"/>
+          </w:tcPr>
+          <w:p>
+            <w:r>
+              <w:t>Nguyễn Huy Hiệu</w:t>
+            </w:r>
+          </w:p>
+        </w:tc>
+        <w:tc>
+          <w:tcPr>
+            <w:tcW w:w="2003" w:type="dxa"/>
+          </w:tcPr>
+          <w:p>
+            <w:r>
+              <w:t>2023602822</w:t>
+            </w:r>
+          </w:p>
+        </w:tc>
+      </w:tr>
+      <w:tr>
+        <w:tc>
+          <w:tcPr>
+            <w:tcW w:w="4234" w:type="dxa"/>
+          </w:tcPr>
+          <w:p>
+            <w:r>
+              <w:t>Nguyễn Đức Trung</w:t>
+            </w:r>
+          </w:p>
+        </w:tc>
+        <w:tc>
+          <w:tcPr>
+            <w:tcW w:w="2003" w:type="dxa"/>
+          </w:tcPr>
+          <w:p>
+            <w:r>
+              <w:t>2023600531</w:t>
+            </w:r>
+          </w:p>
+        </w:tc>
+      </w:tr>
+      <w:tr>
+        <w:tc>
+          <w:tcPr>
+            <w:tcW w:w="4234" w:type="dxa"/>
+          </w:tcPr>
+          <w:p>
+            <w:r>
+              <w:t>Lê Thanh Tuân</w:t>
+            </w:r>
+          </w:p>
+        </w:tc>
+        <w:tc>
+          <w:tcPr>
+            <w:tcW w:w="2003" w:type="dxa"/>
+          </w:tcPr>
+          <w:p>
+            <w:r>
+              <w:t>2023601512</w:t>
+            </w:r>
+          </w:p>
+        </w:tc>
+      </w:tr>
+    </w:tbl>
+    <w:p>
+      <w:pPr>
         <w:rPr>
           <w:lang w:val="vi-VN"/>
         </w:rPr>
-        <w:t>Tên nhóm:…</w:t>
-      </w:r>
+      </w:pPr>
     </w:p>
     <w:p>
       <w:pPr>
@@ -2498,11 +2927,45 @@
           <w:lang w:val="vi-VN"/>
         </w:rPr>
       </w:pPr>
-      <w:r>
+    </w:p>
+    <w:p>
+      <w:pPr>
         <w:rPr>
           <w:lang w:val="vi-VN"/>
         </w:rPr>
-        <w:t>Tên chủ đề: ….</w:t>
+      </w:pPr>
+      <w:bookmarkStart w:id="1" w:name="_GoBack"/>
+      <w:bookmarkEnd w:id="1"/>
+    </w:p>
+    <w:p>
+      <w:r>
+        <w:rPr>
+          <w:lang w:val="vi-VN"/>
+        </w:rPr>
+        <w:t>Tên nhóm:</w:t>
+      </w:r>
+      <w:r>
+        <w:t xml:space="preserve"> 2</w:t>
+      </w:r>
+    </w:p>
+    <w:p>
+      <w:pPr>
+        <w:rPr>
+          <w:b/>
+          <w:bCs/>
+        </w:rPr>
+      </w:pPr>
+      <w:r>
+        <w:rPr>
+          <w:lang w:val="vi-VN"/>
+        </w:rPr>
+        <w:t xml:space="preserve">Tên chủ đề: </w:t>
+      </w:r>
+      <w:r>
+        <w:rPr>
+          <w:bCs/>
+        </w:rPr>
+        <w:t>Chữ ký số Elgmal và ứng dụng trong xác thực tính toàn vẹn của dữ liệu</w:t>
       </w:r>
     </w:p>
     <w:tbl>
@@ -2600,9 +3063,13 @@
         </w:tc>
       </w:tr>
       <w:tr>
+        <w:trPr>
+          <w:trHeight w:val="321"/>
+        </w:trPr>
         <w:tc>
           <w:tcPr>
             <w:tcW w:w="846" w:type="dxa"/>
+            <w:vMerge w:val="restart"/>
           </w:tcPr>
           <w:p>
             <w:pPr>
@@ -2619,27 +3086,11 @@
           </w:tcPr>
           <w:p>
             <w:r>
-              <w:t>A</w:t>
-            </w:r>
-          </w:p>
-          <w:p>
-            <w:r>
-              <w:t>B</w:t>
-            </w:r>
-          </w:p>
-          <w:p>
-            <w:r>
-              <w:t>C</w:t>
-            </w:r>
-          </w:p>
-          <w:p>
-            <w:r>
-              <w:t>D</w:t>
-            </w:r>
-          </w:p>
-          <w:p>
-            <w:r>
-              <w:t>E</w:t>
+              <w:rPr>
+                <w:rStyle w:val="citation-627"/>
+                <w:bCs/>
+              </w:rPr>
+              <w:t>Nguyễn Ánh Vân</w:t>
             </w:r>
           </w:p>
         </w:tc>
@@ -2649,41 +3100,247 @@
           </w:tcPr>
           <w:p>
             <w:r>
-              <w:t>Công việc 1</w:t>
-            </w:r>
-          </w:p>
-          <w:p>
-            <w:r>
-              <w:t>Công việc 2</w:t>
-            </w:r>
-          </w:p>
-          <w:p>
-            <w:r>
-              <w:t>Công việc 3</w:t>
-            </w:r>
-          </w:p>
-          <w:p>
-            <w:r>
-              <w:t>Công việc 4</w:t>
-            </w:r>
-          </w:p>
-          <w:p>
-            <w:r>
-              <w:t>Công việc 5</w:t>
+              <w:rPr>
+                <w:rStyle w:val="citation-622"/>
+              </w:rPr>
+              <w:t>L</w:t>
+            </w:r>
+            <w:r>
+              <w:rPr>
+                <w:rStyle w:val="citation-622"/>
+              </w:rPr>
+              <w:t>ập dàn ý báo cáo, phân công công việc nội bộ nhóm và viết phần Lời nói đầu, Mục 1.3</w:t>
+            </w:r>
+            <w:r>
+              <w:rPr>
+                <w:rStyle w:val="citation-621"/>
+              </w:rPr>
+              <w:t>.</w:t>
             </w:r>
           </w:p>
         </w:tc>
         <w:tc>
           <w:tcPr>
             <w:tcW w:w="4111" w:type="dxa"/>
-          </w:tcPr>
-          <w:p/>
-        </w:tc>
-      </w:tr>
-      <w:tr>
+            <w:vMerge w:val="restart"/>
+          </w:tcPr>
+          <w:p>
+            <w:r>
+              <w:t>Tìm tài liệu, nghiên cứu lý thuyế</w:t>
+            </w:r>
+            <w:r>
+              <w:t xml:space="preserve">t, </w:t>
+            </w:r>
+            <w:r>
+              <w:t xml:space="preserve">nghiên cứu giáo trình và tìm kiếm </w:t>
+            </w:r>
+            <w:r>
+              <w:t xml:space="preserve">thông tin trên </w:t>
+            </w:r>
+            <w:r>
+              <w:t>trên mạng</w:t>
+            </w:r>
+            <w:r>
+              <w:t xml:space="preserve"> internet</w:t>
+            </w:r>
+            <w:r>
+              <w:t>.</w:t>
+            </w:r>
+          </w:p>
+        </w:tc>
+      </w:tr>
+      <w:tr>
+        <w:trPr>
+          <w:trHeight w:val="320"/>
+        </w:trPr>
         <w:tc>
           <w:tcPr>
             <w:tcW w:w="846" w:type="dxa"/>
+            <w:vMerge/>
+          </w:tcPr>
+          <w:p>
+            <w:pPr>
+              <w:jc w:val="center"/>
+            </w:pPr>
+          </w:p>
+        </w:tc>
+        <w:tc>
+          <w:tcPr>
+            <w:tcW w:w="2268" w:type="dxa"/>
+          </w:tcPr>
+          <w:p>
+            <w:r>
+              <w:t>Đào Văn Công</w:t>
+            </w:r>
+          </w:p>
+        </w:tc>
+        <w:tc>
+          <w:tcPr>
+            <w:tcW w:w="5528" w:type="dxa"/>
+          </w:tcPr>
+          <w:p>
+            <w:r>
+              <w:t>Nghiên cứu và viết báo cáo Mục 1.1: Tổng quan về An ninh mạng</w:t>
+            </w:r>
+            <w:r>
+              <w:t>.</w:t>
+            </w:r>
+          </w:p>
+        </w:tc>
+        <w:tc>
+          <w:tcPr>
+            <w:tcW w:w="4111" w:type="dxa"/>
+            <w:vMerge/>
+          </w:tcPr>
+          <w:p/>
+        </w:tc>
+      </w:tr>
+      <w:tr>
+        <w:trPr>
+          <w:trHeight w:val="320"/>
+        </w:trPr>
+        <w:tc>
+          <w:tcPr>
+            <w:tcW w:w="846" w:type="dxa"/>
+            <w:vMerge/>
+          </w:tcPr>
+          <w:p>
+            <w:pPr>
+              <w:jc w:val="center"/>
+            </w:pPr>
+          </w:p>
+        </w:tc>
+        <w:tc>
+          <w:tcPr>
+            <w:tcW w:w="2268" w:type="dxa"/>
+          </w:tcPr>
+          <w:p>
+            <w:r>
+              <w:t>Nguyễn Đức Trung</w:t>
+            </w:r>
+          </w:p>
+        </w:tc>
+        <w:tc>
+          <w:tcPr>
+            <w:tcW w:w="5528" w:type="dxa"/>
+          </w:tcPr>
+          <w:p>
+            <w:r>
+              <w:t>Nghiên cứu và viết báo cáo Mục 1.1: Tổng quan về An ninh mạng</w:t>
+            </w:r>
+            <w:r>
+              <w:t>.</w:t>
+            </w:r>
+          </w:p>
+        </w:tc>
+        <w:tc>
+          <w:tcPr>
+            <w:tcW w:w="4111" w:type="dxa"/>
+            <w:vMerge/>
+          </w:tcPr>
+          <w:p/>
+        </w:tc>
+      </w:tr>
+      <w:tr>
+        <w:trPr>
+          <w:trHeight w:val="320"/>
+        </w:trPr>
+        <w:tc>
+          <w:tcPr>
+            <w:tcW w:w="846" w:type="dxa"/>
+            <w:vMerge/>
+          </w:tcPr>
+          <w:p>
+            <w:pPr>
+              <w:jc w:val="center"/>
+            </w:pPr>
+          </w:p>
+        </w:tc>
+        <w:tc>
+          <w:tcPr>
+            <w:tcW w:w="2268" w:type="dxa"/>
+          </w:tcPr>
+          <w:p>
+            <w:r>
+              <w:t>Nguyễn Huy Hiệu</w:t>
+            </w:r>
+          </w:p>
+        </w:tc>
+        <w:tc>
+          <w:tcPr>
+            <w:tcW w:w="5528" w:type="dxa"/>
+          </w:tcPr>
+          <w:p>
+            <w:r>
+              <w:t>Nghiên cứu và viết báo cáo Mục 1.2: Các kiến thức cơ sở toán học</w:t>
+            </w:r>
+            <w:r>
+              <w:t>.</w:t>
+            </w:r>
+          </w:p>
+        </w:tc>
+        <w:tc>
+          <w:tcPr>
+            <w:tcW w:w="4111" w:type="dxa"/>
+            <w:vMerge/>
+          </w:tcPr>
+          <w:p/>
+        </w:tc>
+      </w:tr>
+      <w:tr>
+        <w:trPr>
+          <w:trHeight w:val="320"/>
+        </w:trPr>
+        <w:tc>
+          <w:tcPr>
+            <w:tcW w:w="846" w:type="dxa"/>
+            <w:vMerge/>
+          </w:tcPr>
+          <w:p>
+            <w:pPr>
+              <w:jc w:val="center"/>
+            </w:pPr>
+          </w:p>
+        </w:tc>
+        <w:tc>
+          <w:tcPr>
+            <w:tcW w:w="2268" w:type="dxa"/>
+          </w:tcPr>
+          <w:p>
+            <w:r>
+              <w:t>Lê Thanh Tuân</w:t>
+            </w:r>
+          </w:p>
+        </w:tc>
+        <w:tc>
+          <w:tcPr>
+            <w:tcW w:w="5528" w:type="dxa"/>
+          </w:tcPr>
+          <w:p>
+            <w:r>
+              <w:t>Nghiên cứu và viết báo cáo Mục 2.1.2: Các phương pháp mã hóa phổ biến hiện nay</w:t>
+            </w:r>
+            <w:r>
+              <w:t>.</w:t>
+            </w:r>
+          </w:p>
+        </w:tc>
+        <w:tc>
+          <w:tcPr>
+            <w:tcW w:w="4111" w:type="dxa"/>
+            <w:vMerge/>
+          </w:tcPr>
+          <w:p/>
+        </w:tc>
+      </w:tr>
+      <w:tr>
+        <w:trPr>
+          <w:trHeight w:val="321"/>
+        </w:trPr>
+        <w:tc>
+          <w:tcPr>
+            <w:tcW w:w="846" w:type="dxa"/>
+            <w:vMerge w:val="restart"/>
           </w:tcPr>
           <w:p>
             <w:pPr>
@@ -2700,71 +3357,220 @@
           </w:tcPr>
           <w:p>
             <w:r>
-              <w:t>A</w:t>
-            </w:r>
-          </w:p>
-          <w:p>
-            <w:r>
-              <w:t>B</w:t>
-            </w:r>
-          </w:p>
-          <w:p>
-            <w:r>
-              <w:t>C</w:t>
-            </w:r>
-          </w:p>
-          <w:p>
-            <w:r>
-              <w:t>D</w:t>
-            </w:r>
-          </w:p>
-          <w:p>
-            <w:r>
-              <w:t>E</w:t>
+              <w:t>Nguyễn Ánh Vân</w:t>
             </w:r>
           </w:p>
         </w:tc>
         <w:tc>
           <w:tcPr>
             <w:tcW w:w="5528" w:type="dxa"/>
-          </w:tcPr>
-          <w:p>
-            <w:r>
-              <w:t>Công việc 1</w:t>
-            </w:r>
-          </w:p>
-          <w:p>
-            <w:r>
-              <w:t>Công việc 2</w:t>
-            </w:r>
-          </w:p>
-          <w:p>
-            <w:r>
-              <w:t>Công việc 3</w:t>
-            </w:r>
-          </w:p>
-          <w:p>
-            <w:r>
-              <w:t>Công việc 4</w:t>
-            </w:r>
-          </w:p>
-          <w:p>
-            <w:r>
-              <w:t>Công việc 5</w:t>
+            <w:vMerge w:val="restart"/>
+          </w:tcPr>
+          <w:p>
+            <w:r>
+              <w:t>Khảo sát sơ bộ về tính ứng dụng của thuật toán Elgamal và bước đầu thiết kế chương trình.</w:t>
             </w:r>
           </w:p>
         </w:tc>
         <w:tc>
           <w:tcPr>
             <w:tcW w:w="4111" w:type="dxa"/>
-          </w:tcPr>
-          <w:p/>
-        </w:tc>
-      </w:tr>
-      <w:tr>
+            <w:vMerge w:val="restart"/>
+          </w:tcPr>
+          <w:p>
+            <w:r>
+              <w:t>Tìm tài liệu, nghiên cứu lý thuyết, nghiên cứu giáo trình và tìm kiếm trên mạng</w:t>
+            </w:r>
+            <w:r>
+              <w:t xml:space="preserve"> internet</w:t>
+            </w:r>
+            <w:r>
+              <w:t>.</w:t>
+            </w:r>
+          </w:p>
+        </w:tc>
+      </w:tr>
+      <w:tr>
+        <w:trPr>
+          <w:trHeight w:val="320"/>
+        </w:trPr>
         <w:tc>
           <w:tcPr>
             <w:tcW w:w="846" w:type="dxa"/>
+            <w:vMerge/>
+          </w:tcPr>
+          <w:p>
+            <w:pPr>
+              <w:jc w:val="center"/>
+            </w:pPr>
+          </w:p>
+        </w:tc>
+        <w:tc>
+          <w:tcPr>
+            <w:tcW w:w="2268" w:type="dxa"/>
+          </w:tcPr>
+          <w:p>
+            <w:r>
+              <w:t>Đào Văn Công</w:t>
+            </w:r>
+          </w:p>
+        </w:tc>
+        <w:tc>
+          <w:tcPr>
+            <w:tcW w:w="5528" w:type="dxa"/>
+            <w:vMerge/>
+          </w:tcPr>
+          <w:p/>
+        </w:tc>
+        <w:tc>
+          <w:tcPr>
+            <w:tcW w:w="4111" w:type="dxa"/>
+            <w:vMerge/>
+          </w:tcPr>
+          <w:p/>
+        </w:tc>
+      </w:tr>
+      <w:tr>
+        <w:trPr>
+          <w:trHeight w:val="320"/>
+        </w:trPr>
+        <w:tc>
+          <w:tcPr>
+            <w:tcW w:w="846" w:type="dxa"/>
+            <w:vMerge/>
+          </w:tcPr>
+          <w:p>
+            <w:pPr>
+              <w:jc w:val="center"/>
+            </w:pPr>
+          </w:p>
+        </w:tc>
+        <w:tc>
+          <w:tcPr>
+            <w:tcW w:w="2268" w:type="dxa"/>
+          </w:tcPr>
+          <w:p>
+            <w:r>
+              <w:t>Nguyễn Đức Trung</w:t>
+            </w:r>
+          </w:p>
+        </w:tc>
+        <w:tc>
+          <w:tcPr>
+            <w:tcW w:w="5528" w:type="dxa"/>
+            <w:vMerge w:val="restart"/>
+          </w:tcPr>
+          <w:p>
+            <w:r>
+              <w:t>Nghiên cứu, tìm hiểu về</w:t>
+            </w:r>
+            <w:r>
+              <w:t xml:space="preserve"> thuật toán</w:t>
+            </w:r>
+            <w:r>
+              <w:t xml:space="preserve"> Elgamal</w:t>
+            </w:r>
+            <w:r>
+              <w:t>.</w:t>
+            </w:r>
+          </w:p>
+        </w:tc>
+        <w:tc>
+          <w:tcPr>
+            <w:tcW w:w="4111" w:type="dxa"/>
+            <w:vMerge/>
+          </w:tcPr>
+          <w:p/>
+        </w:tc>
+      </w:tr>
+      <w:tr>
+        <w:trPr>
+          <w:trHeight w:val="320"/>
+        </w:trPr>
+        <w:tc>
+          <w:tcPr>
+            <w:tcW w:w="846" w:type="dxa"/>
+            <w:vMerge/>
+          </w:tcPr>
+          <w:p>
+            <w:pPr>
+              <w:jc w:val="center"/>
+            </w:pPr>
+          </w:p>
+        </w:tc>
+        <w:tc>
+          <w:tcPr>
+            <w:tcW w:w="2268" w:type="dxa"/>
+          </w:tcPr>
+          <w:p>
+            <w:r>
+              <w:t>Lê Thanh Tuân</w:t>
+            </w:r>
+          </w:p>
+        </w:tc>
+        <w:tc>
+          <w:tcPr>
+            <w:tcW w:w="5528" w:type="dxa"/>
+            <w:vMerge/>
+          </w:tcPr>
+          <w:p/>
+        </w:tc>
+        <w:tc>
+          <w:tcPr>
+            <w:tcW w:w="4111" w:type="dxa"/>
+            <w:vMerge/>
+          </w:tcPr>
+          <w:p/>
+        </w:tc>
+      </w:tr>
+      <w:tr>
+        <w:trPr>
+          <w:trHeight w:val="320"/>
+        </w:trPr>
+        <w:tc>
+          <w:tcPr>
+            <w:tcW w:w="846" w:type="dxa"/>
+            <w:vMerge/>
+          </w:tcPr>
+          <w:p>
+            <w:pPr>
+              <w:jc w:val="center"/>
+            </w:pPr>
+          </w:p>
+        </w:tc>
+        <w:tc>
+          <w:tcPr>
+            <w:tcW w:w="2268" w:type="dxa"/>
+          </w:tcPr>
+          <w:p>
+            <w:r>
+              <w:t>Nguyễn Huy Hiệu</w:t>
+            </w:r>
+          </w:p>
+        </w:tc>
+        <w:tc>
+          <w:tcPr>
+            <w:tcW w:w="5528" w:type="dxa"/>
+            <w:vMerge/>
+          </w:tcPr>
+          <w:p/>
+        </w:tc>
+        <w:tc>
+          <w:tcPr>
+            <w:tcW w:w="4111" w:type="dxa"/>
+            <w:vMerge/>
+          </w:tcPr>
+          <w:p/>
+        </w:tc>
+      </w:tr>
+      <w:tr>
+        <w:trPr>
+          <w:trHeight w:val="321"/>
+        </w:trPr>
+        <w:tc>
+          <w:tcPr>
+            <w:tcW w:w="846" w:type="dxa"/>
+            <w:vMerge w:val="restart"/>
           </w:tcPr>
           <w:p>
             <w:pPr>
@@ -2781,71 +3587,228 @@
           </w:tcPr>
           <w:p>
             <w:r>
-              <w:t>A</w:t>
-            </w:r>
-          </w:p>
-          <w:p>
-            <w:r>
-              <w:t>B</w:t>
-            </w:r>
-          </w:p>
-          <w:p>
-            <w:r>
-              <w:t>C</w:t>
-            </w:r>
-          </w:p>
-          <w:p>
-            <w:r>
-              <w:t>D</w:t>
-            </w:r>
-          </w:p>
-          <w:p>
-            <w:r>
-              <w:t>E</w:t>
+              <w:t>Nguyễn Huy Hiệu</w:t>
             </w:r>
           </w:p>
         </w:tc>
         <w:tc>
           <w:tcPr>
             <w:tcW w:w="5528" w:type="dxa"/>
-          </w:tcPr>
-          <w:p>
-            <w:r>
-              <w:t>Công việc 1</w:t>
-            </w:r>
-          </w:p>
-          <w:p>
-            <w:r>
-              <w:t>Công việc 2</w:t>
-            </w:r>
-          </w:p>
-          <w:p>
-            <w:r>
-              <w:t>Công việc 3</w:t>
-            </w:r>
-          </w:p>
-          <w:p>
-            <w:r>
-              <w:t>Công việc 4</w:t>
-            </w:r>
-          </w:p>
-          <w:p>
-            <w:r>
-              <w:t>Công việc 5</w:t>
+            <w:vMerge w:val="restart"/>
+          </w:tcPr>
+          <w:p>
+            <w:r>
+              <w:t xml:space="preserve">Viết báo cáo phần </w:t>
+            </w:r>
+            <w:r>
+              <w:rPr>
+                <w:bCs/>
+                <w:lang w:val="en-GB"/>
+              </w:rPr>
+              <w:t>2.2. Nghiên cứu, tìm hiểu về Chữ ký số Elgamal</w:t>
+            </w:r>
+            <w:r>
+              <w:rPr>
+                <w:bCs/>
+                <w:lang w:val="en-GB"/>
+              </w:rPr>
+              <w:t>.</w:t>
             </w:r>
           </w:p>
         </w:tc>
         <w:tc>
           <w:tcPr>
             <w:tcW w:w="4111" w:type="dxa"/>
-          </w:tcPr>
-          <w:p/>
-        </w:tc>
-      </w:tr>
-      <w:tr>
+            <w:vMerge w:val="restart"/>
+          </w:tcPr>
+          <w:p>
+            <w:r>
+              <w:t>Tìm tài liệu, nghiên cứu lý thuyết, nghiên cứu giáo trình và tìm kiếm trên mạng internet.</w:t>
+            </w:r>
+          </w:p>
+        </w:tc>
+      </w:tr>
+      <w:tr>
+        <w:trPr>
+          <w:trHeight w:val="320"/>
+        </w:trPr>
         <w:tc>
           <w:tcPr>
             <w:tcW w:w="846" w:type="dxa"/>
+            <w:vMerge/>
+          </w:tcPr>
+          <w:p>
+            <w:pPr>
+              <w:jc w:val="center"/>
+            </w:pPr>
+          </w:p>
+        </w:tc>
+        <w:tc>
+          <w:tcPr>
+            <w:tcW w:w="2268" w:type="dxa"/>
+          </w:tcPr>
+          <w:p>
+            <w:r>
+              <w:t>Nguyễn Đức Trung</w:t>
+            </w:r>
+          </w:p>
+        </w:tc>
+        <w:tc>
+          <w:tcPr>
+            <w:tcW w:w="5528" w:type="dxa"/>
+            <w:vMerge/>
+          </w:tcPr>
+          <w:p/>
+        </w:tc>
+        <w:tc>
+          <w:tcPr>
+            <w:tcW w:w="4111" w:type="dxa"/>
+            <w:vMerge/>
+          </w:tcPr>
+          <w:p/>
+        </w:tc>
+      </w:tr>
+      <w:tr>
+        <w:trPr>
+          <w:trHeight w:val="320"/>
+        </w:trPr>
+        <w:tc>
+          <w:tcPr>
+            <w:tcW w:w="846" w:type="dxa"/>
+            <w:vMerge/>
+          </w:tcPr>
+          <w:p>
+            <w:pPr>
+              <w:jc w:val="center"/>
+            </w:pPr>
+          </w:p>
+        </w:tc>
+        <w:tc>
+          <w:tcPr>
+            <w:tcW w:w="2268" w:type="dxa"/>
+          </w:tcPr>
+          <w:p>
+            <w:r>
+              <w:t>Nguyễn Ánh Vân</w:t>
+            </w:r>
+          </w:p>
+        </w:tc>
+        <w:tc>
+          <w:tcPr>
+            <w:tcW w:w="5528" w:type="dxa"/>
+            <w:vMerge w:val="restart"/>
+          </w:tcPr>
+          <w:p>
+            <w:r>
+              <w:t>Thiết kế kịch bản chương trình và viết báo cáo phần 2.3.1. Thiết kế kịch bản chương trình.</w:t>
+            </w:r>
+          </w:p>
+        </w:tc>
+        <w:tc>
+          <w:tcPr>
+            <w:tcW w:w="4111" w:type="dxa"/>
+            <w:vMerge/>
+          </w:tcPr>
+          <w:p/>
+        </w:tc>
+      </w:tr>
+      <w:tr>
+        <w:trPr>
+          <w:trHeight w:val="320"/>
+        </w:trPr>
+        <w:tc>
+          <w:tcPr>
+            <w:tcW w:w="846" w:type="dxa"/>
+            <w:vMerge/>
+          </w:tcPr>
+          <w:p>
+            <w:pPr>
+              <w:jc w:val="center"/>
+            </w:pPr>
+          </w:p>
+        </w:tc>
+        <w:tc>
+          <w:tcPr>
+            <w:tcW w:w="2268" w:type="dxa"/>
+          </w:tcPr>
+          <w:p>
+            <w:r>
+              <w:t>Đào Văn Công</w:t>
+            </w:r>
+          </w:p>
+        </w:tc>
+        <w:tc>
+          <w:tcPr>
+            <w:tcW w:w="5528" w:type="dxa"/>
+            <w:vMerge/>
+          </w:tcPr>
+          <w:p/>
+        </w:tc>
+        <w:tc>
+          <w:tcPr>
+            <w:tcW w:w="4111" w:type="dxa"/>
+            <w:vMerge/>
+          </w:tcPr>
+          <w:p/>
+        </w:tc>
+      </w:tr>
+      <w:tr>
+        <w:trPr>
+          <w:trHeight w:val="320"/>
+        </w:trPr>
+        <w:tc>
+          <w:tcPr>
+            <w:tcW w:w="846" w:type="dxa"/>
+            <w:vMerge/>
+          </w:tcPr>
+          <w:p>
+            <w:pPr>
+              <w:jc w:val="center"/>
+            </w:pPr>
+          </w:p>
+        </w:tc>
+        <w:tc>
+          <w:tcPr>
+            <w:tcW w:w="2268" w:type="dxa"/>
+          </w:tcPr>
+          <w:p>
+            <w:r>
+              <w:t>Lê Thanh Tuân</w:t>
+            </w:r>
+          </w:p>
+        </w:tc>
+        <w:tc>
+          <w:tcPr>
+            <w:tcW w:w="5528" w:type="dxa"/>
+          </w:tcPr>
+          <w:p>
+            <w:r>
+              <w:t xml:space="preserve">Viết báo cáo phần 2.3.2. </w:t>
+            </w:r>
+            <w:r>
+              <w:t>Giới thiệu ngôn ngữ lập trình sử dụng để cài đặt thuật toán</w:t>
+            </w:r>
+            <w:r>
+              <w:t>.</w:t>
+            </w:r>
+          </w:p>
+        </w:tc>
+        <w:tc>
+          <w:tcPr>
+            <w:tcW w:w="4111" w:type="dxa"/>
+            <w:vMerge/>
+          </w:tcPr>
+          <w:p/>
+        </w:tc>
+      </w:tr>
+      <w:tr>
+        <w:trPr>
+          <w:trHeight w:val="321"/>
+        </w:trPr>
+        <w:tc>
+          <w:tcPr>
+            <w:tcW w:w="846" w:type="dxa"/>
+            <w:vMerge w:val="restart"/>
           </w:tcPr>
           <w:p>
             <w:pPr>
@@ -2862,27 +3825,7 @@
           </w:tcPr>
           <w:p>
             <w:r>
-              <w:t>A</w:t>
-            </w:r>
-          </w:p>
-          <w:p>
-            <w:r>
-              <w:t>B</w:t>
-            </w:r>
-          </w:p>
-          <w:p>
-            <w:r>
-              <w:t>C</w:t>
-            </w:r>
-          </w:p>
-          <w:p>
-            <w:r>
-              <w:t>D</w:t>
-            </w:r>
-          </w:p>
-          <w:p>
-            <w:r>
-              <w:t>E</w:t>
+              <w:t>Nguyễn Ánh Vân</w:t>
             </w:r>
           </w:p>
         </w:tc>
@@ -2892,41 +3835,232 @@
           </w:tcPr>
           <w:p>
             <w:r>
-              <w:t>Công việc 1</w:t>
-            </w:r>
-          </w:p>
-          <w:p>
-            <w:r>
-              <w:t>Công việc 2</w:t>
-            </w:r>
-          </w:p>
-          <w:p>
-            <w:r>
-              <w:t>Công việc 3</w:t>
-            </w:r>
-          </w:p>
-          <w:p>
-            <w:r>
-              <w:t>Công việc 4</w:t>
-            </w:r>
-          </w:p>
-          <w:p>
-            <w:r>
-              <w:t>Công việc 5</w:t>
+              <w:t>Cài đặt chương trình: Mã hóa, giải mã, xác minh, giao diện(Java).</w:t>
             </w:r>
           </w:p>
         </w:tc>
         <w:tc>
           <w:tcPr>
             <w:tcW w:w="4111" w:type="dxa"/>
-          </w:tcPr>
-          <w:p/>
-        </w:tc>
-      </w:tr>
-      <w:tr>
+            <w:vMerge w:val="restart"/>
+          </w:tcPr>
+          <w:p>
+            <w:r>
+              <w:t xml:space="preserve">Sử dụng </w:t>
+            </w:r>
+            <w:r>
+              <w:t>IntelliJ IDEA</w:t>
+            </w:r>
+            <w:r>
+              <w:t xml:space="preserve"> để tiếp tục cài đặt chương trình Java. Sử dụ</w:t>
+            </w:r>
+            <w:r>
+              <w:t>ng Visual Studio</w:t>
+            </w:r>
+            <w:r>
+              <w:t xml:space="preserve"> để cài đặt chương trình</w:t>
+            </w:r>
+            <w:r>
+              <w:t xml:space="preserve"> C#</w:t>
+            </w:r>
+            <w:r>
+              <w:t>.</w:t>
+            </w:r>
+          </w:p>
+        </w:tc>
+      </w:tr>
+      <w:tr>
+        <w:trPr>
+          <w:trHeight w:val="320"/>
+        </w:trPr>
         <w:tc>
           <w:tcPr>
             <w:tcW w:w="846" w:type="dxa"/>
+            <w:vMerge/>
+          </w:tcPr>
+          <w:p>
+            <w:pPr>
+              <w:jc w:val="center"/>
+            </w:pPr>
+          </w:p>
+        </w:tc>
+        <w:tc>
+          <w:tcPr>
+            <w:tcW w:w="2268" w:type="dxa"/>
+          </w:tcPr>
+          <w:p>
+            <w:r>
+              <w:t>Nguyễn Đức Trung</w:t>
+            </w:r>
+          </w:p>
+        </w:tc>
+        <w:tc>
+          <w:tcPr>
+            <w:tcW w:w="5528" w:type="dxa"/>
+          </w:tcPr>
+          <w:p>
+            <w:r>
+              <w:t>Cài đặt chương trình: Sinh khóa(Java).</w:t>
+            </w:r>
+          </w:p>
+        </w:tc>
+        <w:tc>
+          <w:tcPr>
+            <w:tcW w:w="4111" w:type="dxa"/>
+            <w:vMerge/>
+          </w:tcPr>
+          <w:p/>
+        </w:tc>
+      </w:tr>
+      <w:tr>
+        <w:trPr>
+          <w:trHeight w:val="320"/>
+        </w:trPr>
+        <w:tc>
+          <w:tcPr>
+            <w:tcW w:w="846" w:type="dxa"/>
+            <w:vMerge/>
+          </w:tcPr>
+          <w:p>
+            <w:pPr>
+              <w:jc w:val="center"/>
+            </w:pPr>
+          </w:p>
+        </w:tc>
+        <w:tc>
+          <w:tcPr>
+            <w:tcW w:w="2268" w:type="dxa"/>
+          </w:tcPr>
+          <w:p>
+            <w:r>
+              <w:t>Đào Văn Công</w:t>
+            </w:r>
+          </w:p>
+        </w:tc>
+        <w:tc>
+          <w:tcPr>
+            <w:tcW w:w="5528" w:type="dxa"/>
+          </w:tcPr>
+          <w:p>
+            <w:r>
+              <w:t>Cài đặt thuật toán</w:t>
+            </w:r>
+            <w:r>
+              <w:t>:</w:t>
+            </w:r>
+            <w:r>
+              <w:t xml:space="preserve"> tạo khoá và chữ ký</w:t>
+            </w:r>
+            <w:r>
+              <w:t>(C#).</w:t>
+            </w:r>
+          </w:p>
+        </w:tc>
+        <w:tc>
+          <w:tcPr>
+            <w:tcW w:w="4111" w:type="dxa"/>
+            <w:vMerge/>
+          </w:tcPr>
+          <w:p/>
+        </w:tc>
+      </w:tr>
+      <w:tr>
+        <w:trPr>
+          <w:trHeight w:val="320"/>
+        </w:trPr>
+        <w:tc>
+          <w:tcPr>
+            <w:tcW w:w="846" w:type="dxa"/>
+            <w:vMerge/>
+          </w:tcPr>
+          <w:p>
+            <w:pPr>
+              <w:jc w:val="center"/>
+            </w:pPr>
+          </w:p>
+        </w:tc>
+        <w:tc>
+          <w:tcPr>
+            <w:tcW w:w="2268" w:type="dxa"/>
+          </w:tcPr>
+          <w:p>
+            <w:r>
+              <w:t>Lê Thanh Tuân</w:t>
+            </w:r>
+          </w:p>
+        </w:tc>
+        <w:tc>
+          <w:tcPr>
+            <w:tcW w:w="5528" w:type="dxa"/>
+          </w:tcPr>
+          <w:p>
+            <w:r>
+              <w:t>Cài đặt thuật toán</w:t>
+            </w:r>
+            <w:r>
+              <w:t>: xác minh(C#).</w:t>
+            </w:r>
+          </w:p>
+        </w:tc>
+        <w:tc>
+          <w:tcPr>
+            <w:tcW w:w="4111" w:type="dxa"/>
+            <w:vMerge/>
+          </w:tcPr>
+          <w:p/>
+        </w:tc>
+      </w:tr>
+      <w:tr>
+        <w:trPr>
+          <w:trHeight w:val="320"/>
+        </w:trPr>
+        <w:tc>
+          <w:tcPr>
+            <w:tcW w:w="846" w:type="dxa"/>
+            <w:vMerge/>
+          </w:tcPr>
+          <w:p>
+            <w:pPr>
+              <w:jc w:val="center"/>
+            </w:pPr>
+          </w:p>
+        </w:tc>
+        <w:tc>
+          <w:tcPr>
+            <w:tcW w:w="2268" w:type="dxa"/>
+          </w:tcPr>
+          <w:p>
+            <w:r>
+              <w:t>Nguyễn Huy Hiệu</w:t>
+            </w:r>
+          </w:p>
+        </w:tc>
+        <w:tc>
+          <w:tcPr>
+            <w:tcW w:w="5528" w:type="dxa"/>
+          </w:tcPr>
+          <w:p>
+            <w:r>
+              <w:t>Giao diện(C#).</w:t>
+            </w:r>
+          </w:p>
+        </w:tc>
+        <w:tc>
+          <w:tcPr>
+            <w:tcW w:w="4111" w:type="dxa"/>
+            <w:vMerge/>
+          </w:tcPr>
+          <w:p/>
+        </w:tc>
+      </w:tr>
+      <w:tr>
+        <w:trPr>
+          <w:trHeight w:val="271"/>
+        </w:trPr>
+        <w:tc>
+          <w:tcPr>
+            <w:tcW w:w="846" w:type="dxa"/>
+            <w:vMerge w:val="restart"/>
           </w:tcPr>
           <w:p>
             <w:pPr>
@@ -2943,66 +4077,310 @@
           </w:tcPr>
           <w:p>
             <w:r>
-              <w:t>A</w:t>
-            </w:r>
-          </w:p>
-          <w:p>
-            <w:r>
-              <w:t>B</w:t>
-            </w:r>
-          </w:p>
-          <w:p>
-            <w:r>
-              <w:t>C</w:t>
-            </w:r>
-          </w:p>
-          <w:p>
-            <w:r>
-              <w:lastRenderedPageBreak/>
-              <w:t>D</w:t>
-            </w:r>
-          </w:p>
-          <w:p>
-            <w:r>
-              <w:t>E</w:t>
+              <w:t>Nguyễn Ánh Vân</w:t>
             </w:r>
           </w:p>
         </w:tc>
         <w:tc>
           <w:tcPr>
             <w:tcW w:w="5528" w:type="dxa"/>
-          </w:tcPr>
-          <w:p>
-            <w:r>
-              <w:lastRenderedPageBreak/>
-              <w:t>Công việc 1</w:t>
-            </w:r>
-          </w:p>
-          <w:p>
-            <w:r>
-              <w:t>Công việc 2</w:t>
-            </w:r>
-          </w:p>
-          <w:p>
-            <w:r>
-              <w:t>Công việc 3</w:t>
-            </w:r>
-          </w:p>
-          <w:p>
-            <w:r>
-              <w:lastRenderedPageBreak/>
-              <w:t>Công việc 4</w:t>
-            </w:r>
-          </w:p>
-          <w:p>
-            <w:r>
-              <w:t>Công việc 5</w:t>
+            <w:vMerge w:val="restart"/>
+          </w:tcPr>
+          <w:p>
+            <w:r>
+              <w:t>Viết báo cáo phần 2.3.3. Cài đặt thuật toán, giao diện chương trình.</w:t>
             </w:r>
           </w:p>
         </w:tc>
         <w:tc>
           <w:tcPr>
             <w:tcW w:w="4111" w:type="dxa"/>
+            <w:vMerge w:val="restart"/>
+          </w:tcPr>
+          <w:p>
+            <w:r>
+              <w:t>Tìm tài liệu, nghiên cứu lý thuyết, nghiên cứu giáo trình, tìm kiếm trên mạng</w:t>
+            </w:r>
+            <w:r>
+              <w:t xml:space="preserve"> internet</w:t>
+            </w:r>
+            <w:r>
+              <w:t>, trao đổi với các thành viên trong nhóm.</w:t>
+            </w:r>
+          </w:p>
+        </w:tc>
+      </w:tr>
+      <w:tr>
+        <w:trPr>
+          <w:trHeight w:val="266"/>
+        </w:trPr>
+        <w:tc>
+          <w:tcPr>
+            <w:tcW w:w="846" w:type="dxa"/>
+            <w:vMerge/>
+          </w:tcPr>
+          <w:p>
+            <w:pPr>
+              <w:jc w:val="center"/>
+            </w:pPr>
+          </w:p>
+        </w:tc>
+        <w:tc>
+          <w:tcPr>
+            <w:tcW w:w="2268" w:type="dxa"/>
+          </w:tcPr>
+          <w:p>
+            <w:r>
+              <w:t>Đào Văn Công</w:t>
+            </w:r>
+          </w:p>
+        </w:tc>
+        <w:tc>
+          <w:tcPr>
+            <w:tcW w:w="5528" w:type="dxa"/>
+            <w:vMerge/>
+          </w:tcPr>
+          <w:p/>
+        </w:tc>
+        <w:tc>
+          <w:tcPr>
+            <w:tcW w:w="4111" w:type="dxa"/>
+            <w:vMerge/>
+          </w:tcPr>
+          <w:p/>
+        </w:tc>
+      </w:tr>
+      <w:tr>
+        <w:trPr>
+          <w:trHeight w:val="266"/>
+        </w:trPr>
+        <w:tc>
+          <w:tcPr>
+            <w:tcW w:w="846" w:type="dxa"/>
+            <w:vMerge/>
+          </w:tcPr>
+          <w:p>
+            <w:pPr>
+              <w:jc w:val="center"/>
+            </w:pPr>
+          </w:p>
+        </w:tc>
+        <w:tc>
+          <w:tcPr>
+            <w:tcW w:w="2268" w:type="dxa"/>
+          </w:tcPr>
+          <w:p>
+            <w:r>
+              <w:t>Nguyễn Đức Trung</w:t>
+            </w:r>
+          </w:p>
+        </w:tc>
+        <w:tc>
+          <w:tcPr>
+            <w:tcW w:w="5528" w:type="dxa"/>
+            <w:vMerge w:val="restart"/>
+          </w:tcPr>
+          <w:p>
+            <w:r>
+              <w:t xml:space="preserve">Viết báo cáo phần 3.1. Kiến thức kỹ năng đã học được trong quá trình thực hiện đề tài và phần 3.3. </w:t>
+            </w:r>
+            <w:r>
+              <w:t>Đề xuất về tính khả thi của chủ đề nghiên cứu, những thuận lợi, khó khăn</w:t>
+            </w:r>
+            <w:r>
+              <w:t>.</w:t>
+            </w:r>
+          </w:p>
+        </w:tc>
+        <w:tc>
+          <w:tcPr>
+            <w:tcW w:w="4111" w:type="dxa"/>
+            <w:vMerge/>
+          </w:tcPr>
+          <w:p/>
+        </w:tc>
+      </w:tr>
+      <w:tr>
+        <w:trPr>
+          <w:trHeight w:val="266"/>
+        </w:trPr>
+        <w:tc>
+          <w:tcPr>
+            <w:tcW w:w="846" w:type="dxa"/>
+            <w:vMerge/>
+          </w:tcPr>
+          <w:p>
+            <w:pPr>
+              <w:jc w:val="center"/>
+            </w:pPr>
+          </w:p>
+        </w:tc>
+        <w:tc>
+          <w:tcPr>
+            <w:tcW w:w="2268" w:type="dxa"/>
+          </w:tcPr>
+          <w:p>
+            <w:r>
+              <w:t>Lê Thanh Tuân</w:t>
+            </w:r>
+          </w:p>
+        </w:tc>
+        <w:tc>
+          <w:tcPr>
+            <w:tcW w:w="5528" w:type="dxa"/>
+            <w:vMerge/>
+          </w:tcPr>
+          <w:p/>
+        </w:tc>
+        <w:tc>
+          <w:tcPr>
+            <w:tcW w:w="4111" w:type="dxa"/>
+            <w:vMerge/>
+          </w:tcPr>
+          <w:p/>
+        </w:tc>
+      </w:tr>
+      <w:tr>
+        <w:trPr>
+          <w:trHeight w:val="266"/>
+        </w:trPr>
+        <w:tc>
+          <w:tcPr>
+            <w:tcW w:w="846" w:type="dxa"/>
+            <w:vMerge/>
+          </w:tcPr>
+          <w:p>
+            <w:pPr>
+              <w:jc w:val="center"/>
+            </w:pPr>
+          </w:p>
+        </w:tc>
+        <w:tc>
+          <w:tcPr>
+            <w:tcW w:w="2268" w:type="dxa"/>
+          </w:tcPr>
+          <w:p>
+            <w:r>
+              <w:t>Nguyễn Huy Hiệu</w:t>
+            </w:r>
+          </w:p>
+        </w:tc>
+        <w:tc>
+          <w:tcPr>
+            <w:tcW w:w="5528" w:type="dxa"/>
+            <w:vMerge/>
+          </w:tcPr>
+          <w:p/>
+        </w:tc>
+        <w:tc>
+          <w:tcPr>
+            <w:tcW w:w="4111" w:type="dxa"/>
+            <w:vMerge/>
+          </w:tcPr>
+          <w:p/>
+        </w:tc>
+      </w:tr>
+      <w:tr>
+        <w:trPr>
+          <w:trHeight w:val="645"/>
+        </w:trPr>
+        <w:tc>
+          <w:tcPr>
+            <w:tcW w:w="846" w:type="dxa"/>
+            <w:vMerge/>
+          </w:tcPr>
+          <w:p>
+            <w:pPr>
+              <w:jc w:val="center"/>
+            </w:pPr>
+          </w:p>
+        </w:tc>
+        <w:tc>
+          <w:tcPr>
+            <w:tcW w:w="2268" w:type="dxa"/>
+            <w:vMerge w:val="restart"/>
+          </w:tcPr>
+          <w:p>
+            <w:r>
+              <w:t>Nguyễn Ánh Vân</w:t>
+            </w:r>
+          </w:p>
+        </w:tc>
+        <w:tc>
+          <w:tcPr>
+            <w:tcW w:w="5528" w:type="dxa"/>
+          </w:tcPr>
+          <w:p>
+            <w:pPr>
+              <w:rPr>
+                <w:lang w:val="en-GB"/>
+              </w:rPr>
+            </w:pPr>
+            <w:r>
+              <w:t>Viết báo cáo phần 3.2. Bài học kinh nghiệ</w:t>
+            </w:r>
+            <w:r>
+              <w:t xml:space="preserve">m, </w:t>
+            </w:r>
+            <w:r>
+              <w:rPr>
+                <w:lang w:val="en-GB"/>
+              </w:rPr>
+              <w:t>3.3. Đánh giá tính khả thi, thuận lợi và khó khăn của chủ đề nghiên cứu</w:t>
+            </w:r>
+            <w:r>
+              <w:rPr>
+                <w:lang w:val="en-GB"/>
+              </w:rPr>
+              <w:t>.</w:t>
+            </w:r>
+          </w:p>
+          <w:p/>
+        </w:tc>
+        <w:tc>
+          <w:tcPr>
+            <w:tcW w:w="4111" w:type="dxa"/>
+            <w:vMerge/>
+          </w:tcPr>
+          <w:p/>
+        </w:tc>
+      </w:tr>
+      <w:tr>
+        <w:trPr>
+          <w:trHeight w:val="645"/>
+        </w:trPr>
+        <w:tc>
+          <w:tcPr>
+            <w:tcW w:w="846" w:type="dxa"/>
+            <w:vMerge/>
+          </w:tcPr>
+          <w:p>
+            <w:pPr>
+              <w:jc w:val="center"/>
+            </w:pPr>
+          </w:p>
+        </w:tc>
+        <w:tc>
+          <w:tcPr>
+            <w:tcW w:w="2268" w:type="dxa"/>
+            <w:vMerge/>
+          </w:tcPr>
+          <w:p/>
+        </w:tc>
+        <w:tc>
+          <w:tcPr>
+            <w:tcW w:w="5528" w:type="dxa"/>
+          </w:tcPr>
+          <w:p>
+            <w:r>
+              <w:t>Tổng hợp, chỉnh sửa báo cáo.</w:t>
+            </w:r>
+          </w:p>
+        </w:tc>
+        <w:tc>
+          <w:tcPr>
+            <w:tcW w:w="4111" w:type="dxa"/>
+            <w:vMerge/>
           </w:tcPr>
           <w:p/>
         </w:tc>
@@ -4179,6 +5557,7 @@
   <w:style w:type="paragraph" w:default="1" w:styleId="Normal">
     <w:name w:val="Normal"/>
     <w:qFormat/>
+    <w:rsid w:val="00A60BCD"/>
   </w:style>
   <w:style w:type="paragraph" w:styleId="Heading2">
     <w:name w:val="heading 2"/>
@@ -4228,7 +5607,6 @@
   <w:style w:type="character" w:default="1" w:styleId="DefaultParagraphFont">
     <w:name w:val="Default Paragraph Font"/>
     <w:uiPriority w:val="1"/>
-    <w:semiHidden/>
     <w:unhideWhenUsed/>
   </w:style>
   <w:style w:type="table" w:default="1" w:styleId="TableNormal">
@@ -4308,6 +5686,71 @@
       <w:color w:val="2E74B5" w:themeColor="accent1" w:themeShade="BF"/>
       <w:szCs w:val="26"/>
     </w:rPr>
+  </w:style>
+  <w:style w:type="paragraph" w:styleId="NormalWeb">
+    <w:name w:val="Normal (Web)"/>
+    <w:basedOn w:val="Normal"/>
+    <w:uiPriority w:val="99"/>
+    <w:unhideWhenUsed/>
+    <w:rsid w:val="00A60BCD"/>
+    <w:pPr>
+      <w:spacing w:before="100" w:beforeAutospacing="1" w:after="100" w:afterAutospacing="1" w:line="240" w:lineRule="auto"/>
+    </w:pPr>
+    <w:rPr>
+      <w:rFonts w:eastAsia="Times New Roman" w:cs="Times New Roman"/>
+      <w:sz w:val="24"/>
+      <w:szCs w:val="24"/>
+    </w:rPr>
+  </w:style>
+  <w:style w:type="character" w:styleId="Hyperlink">
+    <w:name w:val="Hyperlink"/>
+    <w:basedOn w:val="DefaultParagraphFont"/>
+    <w:uiPriority w:val="99"/>
+    <w:unhideWhenUsed/>
+    <w:rsid w:val="00A60BCD"/>
+    <w:rPr>
+      <w:color w:val="0000FF"/>
+      <w:u w:val="single"/>
+    </w:rPr>
+  </w:style>
+  <w:style w:type="paragraph" w:styleId="Header">
+    <w:name w:val="header"/>
+    <w:basedOn w:val="Normal"/>
+    <w:link w:val="HeaderChar"/>
+    <w:uiPriority w:val="99"/>
+    <w:semiHidden/>
+    <w:unhideWhenUsed/>
+    <w:rsid w:val="00A60BCD"/>
+    <w:pPr>
+      <w:tabs>
+        <w:tab w:val="center" w:pos="4680"/>
+        <w:tab w:val="right" w:pos="9360"/>
+      </w:tabs>
+      <w:spacing w:after="0" w:line="240" w:lineRule="auto"/>
+    </w:pPr>
+  </w:style>
+  <w:style w:type="character" w:customStyle="1" w:styleId="HeaderChar">
+    <w:name w:val="Header Char"/>
+    <w:basedOn w:val="DefaultParagraphFont"/>
+    <w:link w:val="Header"/>
+    <w:uiPriority w:val="99"/>
+    <w:semiHidden/>
+    <w:rsid w:val="00A60BCD"/>
+  </w:style>
+  <w:style w:type="character" w:customStyle="1" w:styleId="citation-627">
+    <w:name w:val="citation-627"/>
+    <w:basedOn w:val="DefaultParagraphFont"/>
+    <w:rsid w:val="00BF4FC0"/>
+  </w:style>
+  <w:style w:type="character" w:customStyle="1" w:styleId="citation-622">
+    <w:name w:val="citation-622"/>
+    <w:basedOn w:val="DefaultParagraphFont"/>
+    <w:rsid w:val="00BF4FC0"/>
+  </w:style>
+  <w:style w:type="character" w:customStyle="1" w:styleId="citation-621">
+    <w:name w:val="citation-621"/>
+    <w:basedOn w:val="DefaultParagraphFont"/>
+    <w:rsid w:val="00BF4FC0"/>
   </w:style>
 </w:styles>
 </file>

</xml_diff>